<commit_message>
Hide Turkish from the language switcher and show an active search-filter chip. Ship the AZ/EN/RU/KY site rebuild with refreshed AZ narration and shared assets.
Co-authored-by: Cursor <cursoragent@cursor.com>
</commit_message>
<xml_diff>
--- a/az/stories/a-compliment.docx
+++ b/az/stories/a-compliment.docx
@@ -4,439 +4,344 @@
   <w:body>
     <w:p>
       <w:pPr>
-        <w:pStyle w:val="Heading1"/>
+        <w:spacing w:before="0" w:after="60"/>
+        <w:jc w:val="left"/>
       </w:pPr>
       <w:r>
+        <w:rPr>
+          <w:rFonts w:ascii="Arial" w:hAnsi="Arial" w:eastAsia="Arial"/>
+          <w:i w:val="0"/>
+          <w:color w:val="000000"/>
+          <w:sz w:val="52"/>
+        </w:rPr>
         <w:t>İltifat</w:t>
       </w:r>
     </w:p>
     <w:p>
       <w:pPr>
-        <w:ind w:firstLine="425"/>
-        <w:jc w:val="both"/>
+        <w:jc w:val="left"/>
       </w:pPr>
       <w:r>
         <w:rPr>
-          <w:rFonts w:ascii="Times New Roman" w:hAnsi="Times New Roman" w:cs="Times New Roman"/>
-          <w:b w:val="0"/>
+          <w:rFonts w:ascii="Arial" w:hAnsi="Arial" w:eastAsia="Arial"/>
           <w:i w:val="0"/>
-          <w:sz w:val="24"/>
+          <w:color w:val="000000"/>
+          <w:sz w:val="22"/>
         </w:rPr>
-        <w:t>Mariya anası ilə birlikdə Nyu-Yorkda kiçik bir mənzildə yaşayırdı. Böyük bir şirkətdə katibə işləyirdi; həyatı olduqca darıxdırıcı və adi idi.</w:t>
+        <w:t>Mariya anası ilə birlikdə Nyu-Yorkda kiçik bir mənzildə yaşayırdı. Böyük bir şirkətdə katibə işləyirdi. Həyatı sakit, adi və bir qədər darıxdırıcı keçirdi. İş yerində isə demək olar ki, heç kim ona diqqət yetirmirdi.</w:t>
       </w:r>
     </w:p>
     <w:p>
       <w:pPr>
-        <w:ind w:firstLine="425"/>
-        <w:jc w:val="both"/>
+        <w:jc w:val="left"/>
       </w:pPr>
       <w:r>
         <w:rPr>
-          <w:rFonts w:ascii="Times New Roman" w:hAnsi="Times New Roman" w:cs="Times New Roman"/>
-          <w:b w:val="0"/>
+          <w:rFonts w:ascii="Arial" w:hAnsi="Arial" w:eastAsia="Arial"/>
           <w:i w:val="0"/>
-          <w:sz w:val="24"/>
+          <w:color w:val="000000"/>
+          <w:sz w:val="22"/>
         </w:rPr>
-        <w:t>İşdə heç kim ona fikir vermirdi...</w:t>
+        <w:t>Bir səhər işə gedərkən küçədə yeni açılmış papaq mağazası gördü və maraqla içəri girdi. Mağazada anası ilə birlikdə balaca bir qız və özünə papaq seçən başqa bir müştəri vardı.</w:t>
       </w:r>
     </w:p>
     <w:p>
       <w:pPr>
-        <w:ind w:firstLine="425"/>
-        <w:jc w:val="both"/>
+        <w:jc w:val="left"/>
       </w:pPr>
       <w:r>
         <w:rPr>
-          <w:rFonts w:ascii="Times New Roman" w:hAnsi="Times New Roman" w:cs="Times New Roman"/>
-          <w:b w:val="0"/>
+          <w:rFonts w:ascii="Arial" w:hAnsi="Arial" w:eastAsia="Arial"/>
           <w:i w:val="0"/>
-          <w:sz w:val="24"/>
+          <w:color w:val="000000"/>
+          <w:sz w:val="22"/>
         </w:rPr>
-        <w:t>Bir səhər işə gedərkən Mariya küçədə yeni bir papaq mağazasının açıldığını gördü. Maraqla içəri girdi.</w:t>
+        <w:t>Mariya bir neçə papağı sınaqdan keçirdi. Onlardan biri xüsusilə xoşuna gəldi. Papağı başına qoyan kimi balaca qız heyranlıqla səsləndi:</w:t>
       </w:r>
     </w:p>
     <w:p>
       <w:pPr>
-        <w:ind w:firstLine="425"/>
-        <w:jc w:val="both"/>
+        <w:jc w:val="left"/>
       </w:pPr>
       <w:r>
         <w:rPr>
-          <w:rFonts w:ascii="Times New Roman" w:hAnsi="Times New Roman" w:cs="Times New Roman"/>
-          <w:b w:val="0"/>
+          <w:rFonts w:ascii="Arial" w:hAnsi="Arial" w:eastAsia="Arial"/>
           <w:i w:val="0"/>
-          <w:sz w:val="24"/>
+          <w:color w:val="000000"/>
+          <w:sz w:val="22"/>
         </w:rPr>
-        <w:t>Mağazada anası ilə bir balaca qız, bir də özünə papaq axtaran başqa bir müştəri var idi. Mariya bir neçə papağı geyib yoxladı. Birindən çox xoşu gəldi, onu başına qoydu. Papaq ona çox yaraşdı.</w:t>
+        <w:t>— Ana, bax, o xanım bu papaqda necə də gözəl görünür!</w:t>
       </w:r>
     </w:p>
     <w:p>
       <w:pPr>
-        <w:ind w:firstLine="425"/>
-        <w:jc w:val="both"/>
+        <w:jc w:val="left"/>
       </w:pPr>
       <w:r>
         <w:rPr>
-          <w:rFonts w:ascii="Times New Roman" w:hAnsi="Times New Roman" w:cs="Times New Roman"/>
-          <w:b w:val="0"/>
+          <w:rFonts w:ascii="Arial" w:hAnsi="Arial" w:eastAsia="Arial"/>
           <w:i w:val="0"/>
-          <w:sz w:val="24"/>
+          <w:color w:val="000000"/>
+          <w:sz w:val="22"/>
         </w:rPr>
-        <w:t>Mariyanı izləyən balaca qız: «Ana, gör o papaqlı qadın necə gözəl görünür!» deyə səsləndi.</w:t>
+        <w:t>Qızın anası Mariyaya tərəf dönüb dedi:</w:t>
       </w:r>
     </w:p>
     <w:p>
       <w:pPr>
-        <w:ind w:firstLine="425"/>
-        <w:jc w:val="both"/>
+        <w:jc w:val="left"/>
       </w:pPr>
       <w:r>
         <w:rPr>
-          <w:rFonts w:ascii="Times New Roman" w:hAnsi="Times New Roman" w:cs="Times New Roman"/>
-          <w:b w:val="0"/>
+          <w:rFonts w:ascii="Arial" w:hAnsi="Arial" w:eastAsia="Arial"/>
           <w:i w:val="0"/>
-          <w:sz w:val="24"/>
+          <w:color w:val="000000"/>
+          <w:sz w:val="22"/>
         </w:rPr>
-        <w:t>Ana Mariyaya müraciət etdi:</w:t>
+        <w:t>— Xanım, bu papaq sizə çox yaraşır.</w:t>
       </w:r>
     </w:p>
     <w:p>
       <w:pPr>
-        <w:ind w:firstLine="425"/>
-        <w:jc w:val="both"/>
+        <w:jc w:val="left"/>
       </w:pPr>
       <w:r>
         <w:rPr>
-          <w:rFonts w:ascii="Times New Roman" w:hAnsi="Times New Roman" w:cs="Times New Roman"/>
-          <w:b w:val="0"/>
+          <w:rFonts w:ascii="Arial" w:hAnsi="Arial" w:eastAsia="Arial"/>
           <w:i w:val="0"/>
-          <w:sz w:val="24"/>
+          <w:color w:val="000000"/>
+          <w:sz w:val="22"/>
         </w:rPr>
-        <w:t>— Xanım, bu papaq sizə çox yaraşır, — dedi.</w:t>
+        <w:t>Digər müştəri də onlara qoşuldu:</w:t>
       </w:r>
     </w:p>
     <w:p>
       <w:pPr>
-        <w:ind w:firstLine="425"/>
-        <w:jc w:val="both"/>
+        <w:jc w:val="left"/>
       </w:pPr>
       <w:r>
         <w:rPr>
-          <w:rFonts w:ascii="Times New Roman" w:hAnsi="Times New Roman" w:cs="Times New Roman"/>
-          <w:b w:val="0"/>
+          <w:rFonts w:ascii="Arial" w:hAnsi="Arial" w:eastAsia="Arial"/>
           <w:i w:val="0"/>
-          <w:sz w:val="24"/>
+          <w:color w:val="000000"/>
+          <w:sz w:val="22"/>
         </w:rPr>
-        <w:t>Digər müştəri də yaxınlaşdı: «Xanım, siz bu papaqda çox gözəl görünürsünüz!»</w:t>
+        <w:t>— Doğrudan da, bu papaqda çox gözəl görünürsünüz!</w:t>
       </w:r>
     </w:p>
     <w:p>
       <w:pPr>
-        <w:ind w:firstLine="425"/>
-        <w:jc w:val="both"/>
+        <w:jc w:val="left"/>
       </w:pPr>
       <w:r>
         <w:rPr>
-          <w:rFonts w:ascii="Times New Roman" w:hAnsi="Times New Roman" w:cs="Times New Roman"/>
-          <w:b w:val="0"/>
+          <w:rFonts w:ascii="Arial" w:hAnsi="Arial" w:eastAsia="Arial"/>
           <w:i w:val="0"/>
-          <w:sz w:val="24"/>
+          <w:color w:val="000000"/>
+          <w:sz w:val="22"/>
         </w:rPr>
-        <w:t>Mariya güzgüyə tərəf getdi, özünə baxdı.</w:t>
+        <w:t>Mariya güzgünün qarşısına keçib özünə baxdı. Həyatında ilk dəfə idi ki, güzgüdəki əksini bu qədər bəyənirdi. Üzündə təbəssüm yarandı. Kassaya yaxınlaşıb papağın pulunu ödədi.</w:t>
       </w:r>
     </w:p>
     <w:p>
       <w:pPr>
-        <w:ind w:firstLine="425"/>
-        <w:jc w:val="both"/>
+        <w:jc w:val="left"/>
       </w:pPr>
       <w:r>
         <w:rPr>
-          <w:rFonts w:ascii="Times New Roman" w:hAnsi="Times New Roman" w:cs="Times New Roman"/>
-          <w:b w:val="0"/>
+          <w:rFonts w:ascii="Arial" w:hAnsi="Arial" w:eastAsia="Arial"/>
           <w:i w:val="0"/>
-          <w:sz w:val="24"/>
+          <w:color w:val="000000"/>
+          <w:sz w:val="22"/>
         </w:rPr>
-        <w:t>Həyatında ilk dəfə idi ki, güzgüdəki əksini bu qədər bəyənirdi. Əla görünürdü.</w:t>
+        <w:t>Mağazadan çıxanda sanki qarşısında tamam başqa bir dünya açıldı. Çiçəklərin rəngləri əvvəllər heç vaxt görmədiyi qədər canlı, təmiz havanın qoxusu isə daha xoş idi. Küçədəki maşınların və insanların səsi belə ahəngdar bir melodiya kimi gəlirdi. Mariya özünü gözəl və xoşbəxt hiss edirdi.</w:t>
       </w:r>
     </w:p>
     <w:p>
       <w:pPr>
-        <w:ind w:firstLine="425"/>
-        <w:jc w:val="both"/>
+        <w:jc w:val="left"/>
       </w:pPr>
       <w:r>
         <w:rPr>
-          <w:rFonts w:ascii="Times New Roman" w:hAnsi="Times New Roman" w:cs="Times New Roman"/>
-          <w:b w:val="0"/>
+          <w:rFonts w:ascii="Arial" w:hAnsi="Arial" w:eastAsia="Arial"/>
           <w:i w:val="0"/>
-          <w:sz w:val="24"/>
+          <w:color w:val="000000"/>
+          <w:sz w:val="22"/>
         </w:rPr>
-        <w:t>Gülə-gülə kassaya yaxınlaşdı, papağın pulunu ödədi.</w:t>
+        <w:t>Ofis binasına çatanda mühafizəçi qapını açıb ona “Sabahınız xeyir!” dedi. Liftdə kimsə hansı mərtəbəyə getdiyini soruşub onun əvəzinə düyməni basdı. İş yoldaşları bütün gün ona heyranlıqla baxır, necə gözəl göründüyünü söyləyirdilər. Sanki Mariyanı ilk dəfə görürdülər. Meneceri isə yeni layihə barədə fikrini öyrənmək üçün onu nahara dəvət etdi.</w:t>
       </w:r>
     </w:p>
     <w:p>
       <w:pPr>
-        <w:ind w:firstLine="425"/>
-        <w:jc w:val="both"/>
+        <w:jc w:val="left"/>
       </w:pPr>
       <w:r>
         <w:rPr>
-          <w:rFonts w:ascii="Times New Roman" w:hAnsi="Times New Roman" w:cs="Times New Roman"/>
-          <w:b w:val="0"/>
+          <w:rFonts w:ascii="Arial" w:hAnsi="Arial" w:eastAsia="Arial"/>
           <w:i w:val="0"/>
-          <w:sz w:val="24"/>
+          <w:color w:val="000000"/>
+          <w:sz w:val="22"/>
         </w:rPr>
-        <w:t>Çölə çıxanda qarşısında tamam yeni bir dünya açıldı... Çiçəklərin rənglərinin bu qədər gözəl olduğunu heç vaxt görməmişdi. Təmiz havanın xoş qoxusu, maşınların və insanların səsi ahəngdar bir melodiya kimi idi...</w:t>
+        <w:t>Sehrli gün başa çatanda Mariya hələ də gülümsəyirdi. Həyatının bir anda necə dəyişdiyini düşünür və bütün bunları yeni papağı ilə əlaqələndirirdi.</w:t>
       </w:r>
     </w:p>
     <w:p>
       <w:pPr>
-        <w:ind w:firstLine="425"/>
-        <w:jc w:val="both"/>
+        <w:jc w:val="left"/>
       </w:pPr>
       <w:r>
         <w:rPr>
-          <w:rFonts w:ascii="Times New Roman" w:hAnsi="Times New Roman" w:cs="Times New Roman"/>
-          <w:b w:val="0"/>
+          <w:rFonts w:ascii="Arial" w:hAnsi="Arial" w:eastAsia="Arial"/>
           <w:i w:val="0"/>
-          <w:sz w:val="24"/>
+          <w:color w:val="000000"/>
+          <w:sz w:val="22"/>
         </w:rPr>
-        <w:t>O, özünü çox gözəl hiss edirdi.</w:t>
+        <w:t>Taksiyə minib evə qayıtdı. Qapını açan anası onu görən kimi heyrətlə dedi:</w:t>
       </w:r>
     </w:p>
     <w:p>
       <w:pPr>
-        <w:ind w:firstLine="425"/>
-        <w:jc w:val="both"/>
+        <w:jc w:val="left"/>
       </w:pPr>
       <w:r>
         <w:rPr>
-          <w:rFonts w:ascii="Times New Roman" w:hAnsi="Times New Roman" w:cs="Times New Roman"/>
-          <w:b w:val="0"/>
+          <w:rFonts w:ascii="Arial" w:hAnsi="Arial" w:eastAsia="Arial"/>
           <w:i w:val="0"/>
-          <w:sz w:val="24"/>
+          <w:color w:val="000000"/>
+          <w:sz w:val="22"/>
         </w:rPr>
-        <w:t>Ofis binasına çatanda mühafizəçi qapını açıb «sabahınız xeyir» dedi.</w:t>
+        <w:t>— Mariya, necə də gözəl görünürsən! Gözlərin uşaqlıq illərindəki kimi parıldayır!</w:t>
       </w:r>
     </w:p>
     <w:p>
       <w:pPr>
-        <w:ind w:firstLine="425"/>
-        <w:jc w:val="both"/>
+        <w:jc w:val="left"/>
       </w:pPr>
       <w:r>
         <w:rPr>
-          <w:rFonts w:ascii="Times New Roman" w:hAnsi="Times New Roman" w:cs="Times New Roman"/>
-          <w:b w:val="0"/>
+          <w:rFonts w:ascii="Arial" w:hAnsi="Arial" w:eastAsia="Arial"/>
           <w:i w:val="0"/>
-          <w:sz w:val="24"/>
-        </w:rPr>
-        <w:t>Liftdəkilər ondan neçənci mərtəbəni soruşdu, kimsə onun üçün düyməni basdı.</w:t>
-      </w:r>
-    </w:p>
-    <w:p>
-      <w:pPr>
-        <w:ind w:firstLine="425"/>
-        <w:jc w:val="both"/>
-      </w:pPr>
-      <w:r>
-        <w:rPr>
-          <w:rFonts w:ascii="Times New Roman" w:hAnsi="Times New Roman" w:cs="Times New Roman"/>
-          <w:b w:val="0"/>
-          <w:i w:val="0"/>
-          <w:sz w:val="24"/>
-        </w:rPr>
-        <w:t>Ofisdəkilər bütün günü ona heyranlıqla baxdı, bu gün necə gözəl göründüyünü dedi, sanki onu ilk dəfə görürdülər.</w:t>
-      </w:r>
-    </w:p>
-    <w:p>
-      <w:pPr>
-        <w:ind w:firstLine="425"/>
-        <w:jc w:val="both"/>
-      </w:pPr>
-      <w:r>
-        <w:rPr>
-          <w:rFonts w:ascii="Times New Roman" w:hAnsi="Times New Roman" w:cs="Times New Roman"/>
-          <w:b w:val="0"/>
-          <w:i w:val="0"/>
-          <w:sz w:val="24"/>
-        </w:rPr>
-        <w:t>Meneceri yeni iş barədə fikrini öyrənmək üçün onu nahara dəvət etdi.</w:t>
-      </w:r>
-    </w:p>
-    <w:p>
-      <w:pPr>
-        <w:ind w:firstLine="425"/>
-        <w:jc w:val="both"/>
-      </w:pPr>
-      <w:r>
-        <w:rPr>
-          <w:rFonts w:ascii="Times New Roman" w:hAnsi="Times New Roman" w:cs="Times New Roman"/>
-          <w:b w:val="0"/>
-          <w:i w:val="0"/>
-          <w:sz w:val="24"/>
-        </w:rPr>
-        <w:t>Bu sehrli iş günü bitəndə Mariya hələ də gülümsəyirdi. Yaşadığı möcüzəli günü və həyatının bir anda necə dəyişdiyini düşünürdü. Hamısı yeni papaq sayəsində...</w:t>
-      </w:r>
-    </w:p>
-    <w:p>
-      <w:pPr>
-        <w:ind w:firstLine="425"/>
-        <w:jc w:val="both"/>
-      </w:pPr>
-      <w:r>
-        <w:rPr>
-          <w:rFonts w:ascii="Times New Roman" w:hAnsi="Times New Roman" w:cs="Times New Roman"/>
-          <w:b w:val="0"/>
-          <w:i w:val="0"/>
-          <w:sz w:val="24"/>
-        </w:rPr>
-        <w:t>Taksiyə minib evə yollandı. Evə çatanda anası qapını açdı və Mariyanı görəndə heyrətdən donub qaldı: «Mariya, necə də gözəl görünürsən! Gözlərin uşaqlıqdakı kimi parıldayır!» dedi.</w:t>
-      </w:r>
-    </w:p>
-    <w:p>
-      <w:pPr>
-        <w:ind w:firstLine="425"/>
-        <w:jc w:val="both"/>
-      </w:pPr>
-      <w:r>
-        <w:rPr>
-          <w:rFonts w:ascii="Times New Roman" w:hAnsi="Times New Roman" w:cs="Times New Roman"/>
-          <w:b w:val="0"/>
-          <w:i w:val="0"/>
-          <w:sz w:val="24"/>
+          <w:color w:val="000000"/>
+          <w:sz w:val="22"/>
         </w:rPr>
         <w:t>— Bəli, ana, hamısı yeni papağım sayəsindədir. Bu gün heyrətamiz bir gün keçirdim!</w:t>
       </w:r>
     </w:p>
     <w:p>
       <w:pPr>
-        <w:ind w:firstLine="425"/>
-        <w:jc w:val="both"/>
+        <w:jc w:val="left"/>
       </w:pPr>
       <w:r>
         <w:rPr>
-          <w:rFonts w:ascii="Times New Roman" w:hAnsi="Times New Roman" w:cs="Times New Roman"/>
-          <w:b w:val="0"/>
+          <w:rFonts w:ascii="Arial" w:hAnsi="Arial" w:eastAsia="Arial"/>
           <w:i w:val="0"/>
-          <w:sz w:val="24"/>
+          <w:color w:val="000000"/>
+          <w:sz w:val="22"/>
         </w:rPr>
-        <w:t>— Hansı papaq? — deyə anası çaşqın halda soruşdu.</w:t>
+        <w:t>— Hansı papaq? — deyə anası təəccüblə soruşdu.</w:t>
       </w:r>
     </w:p>
     <w:p>
       <w:pPr>
-        <w:ind w:firstLine="425"/>
-        <w:jc w:val="both"/>
+        <w:jc w:val="left"/>
       </w:pPr>
       <w:r>
         <w:rPr>
-          <w:rFonts w:ascii="Times New Roman" w:hAnsi="Times New Roman" w:cs="Times New Roman"/>
-          <w:b w:val="0"/>
+          <w:rFonts w:ascii="Arial" w:hAnsi="Arial" w:eastAsia="Arial"/>
           <w:i w:val="0"/>
-          <w:sz w:val="24"/>
+          <w:color w:val="000000"/>
+          <w:sz w:val="22"/>
         </w:rPr>
-        <w:t>Mariya narahat oldu. Üzündəki ifadə birdən dəyişdi. Başına toxundu və gördü ki, həyatını dəyişən papaq yoxdur. Taksiyə minəndə onu götürdüyünü xatırlamadı. Bəlkə naharda unutmuşdu? Ofisdə böyük həvəslə işləyərkən papağına heç toxunmamışdı da. Mağazanı yadına saldı: papağı ilk dəfə necə gördüyünü, necə geydiyini, ətrafdakıların heyranlığını, papağı götürüb kassaya getdiyini, pul kisəsini çıxarıb papağı masanın üstünə qoyduğunu xatırladı...</w:t>
+        <w:t>Mariya təşvişlə başına toxundu. Papaq yox idi. Onu taksidə, nahar etdiyi yerdə və ya ofisdə unutduğunu düşünməyə başladı. Sonra mağazada baş verənləri bir-bir xatırladı: papağı başına qoymasını, insanların iltifatlarını, kassaya yaxınlaşıb pul kisəsini çıxarmasını və papağı piştaxtanın üstünə qoymasını...</w:t>
       </w:r>
     </w:p>
     <w:p>
       <w:pPr>
-        <w:ind w:firstLine="425"/>
-        <w:jc w:val="both"/>
+        <w:jc w:val="left"/>
       </w:pPr>
       <w:r>
         <w:rPr>
-          <w:rFonts w:ascii="Times New Roman" w:hAnsi="Times New Roman" w:cs="Times New Roman"/>
-          <w:b w:val="0"/>
+          <w:rFonts w:ascii="Arial" w:hAnsi="Arial" w:eastAsia="Arial"/>
           <w:i w:val="0"/>
-          <w:sz w:val="24"/>
+          <w:color w:val="000000"/>
+          <w:sz w:val="22"/>
         </w:rPr>
-        <w:t>Amma!</w:t>
+        <w:t>Birdən hər şeyi anladı: papağı mağazada unutmuş, gözləri sevincdən parıldaya-parıldaya, papaqsız bayıra çıxmışdı.</w:t>
       </w:r>
     </w:p>
     <w:p>
       <w:pPr>
-        <w:ind w:firstLine="425"/>
-        <w:jc w:val="both"/>
+        <w:jc w:val="left"/>
       </w:pPr>
       <w:r>
         <w:rPr>
-          <w:rFonts w:ascii="Times New Roman" w:hAnsi="Times New Roman" w:cs="Times New Roman"/>
-          <w:b w:val="0"/>
+          <w:rFonts w:ascii="Arial" w:hAnsi="Arial" w:eastAsia="Arial"/>
           <w:i w:val="0"/>
-          <w:sz w:val="24"/>
+          <w:color w:val="000000"/>
+          <w:sz w:val="22"/>
         </w:rPr>
-        <w:t>Həyəcanından papağı piştaxtanın üstündə necə unutduğunu, gözləri parıltı içində papaqsız bayıra çıxdığını da xatırladı...</w:t>
+        <w:t>Deməli, Mariyanı bütün gün xoşbəxt edən papaq deyil, insanların səmimi sözlərinin onda oyatdığı özünəinam və sevinc idi. Dəyişən dünya yox, Mariyanın dünyaya baxışı olmuşdu.</w:t>
       </w:r>
     </w:p>
     <w:p>
       <w:pPr>
-        <w:ind w:firstLine="425"/>
-        <w:jc w:val="both"/>
+        <w:pStyle w:val="Moral"/>
+        <w:keepNext/>
+        <w:keepLines/>
+        <w:widowControl/>
+        <w:spacing w:before="240" w:after="180" w:line="283" w:lineRule="auto"/>
+        <w:ind w:left="240" w:right="240"/>
+        <w:jc w:val="left"/>
+        <w:pBdr>
+          <w:top w:val="single" w:sz="8" w:space="7" w:color="E8D59A"/>
+          <w:left w:val="single" w:sz="32" w:space="11" w:color="C6A23A"/>
+          <w:bottom w:val="single" w:sz="8" w:space="7" w:color="E8D59A"/>
+          <w:right w:val="single" w:sz="8" w:space="11" w:color="E8D59A"/>
+        </w:pBdr>
+        <w:shd w:val="clear" w:color="auto" w:fill="FFF8E1"/>
       </w:pPr>
       <w:r>
         <w:rPr>
-          <w:rFonts w:ascii="Times New Roman" w:hAnsi="Times New Roman" w:cs="Times New Roman"/>
+          <w:rFonts w:ascii="Arial" w:hAnsi="Arial" w:eastAsia="Arial" w:cs="Arial"/>
+          <w:b/>
+          <w:i w:val="0"/>
+          <w:color w:val="9A7417"/>
+          <w:sz w:val="22"/>
+        </w:rPr>
+        <w:t xml:space="preserve">İbrət: </w:t>
+      </w:r>
+      <w:r>
+        <w:rPr>
+          <w:rFonts w:ascii="Arial" w:hAnsi="Arial" w:eastAsia="Arial" w:cs="Arial"/>
           <w:b w:val="0"/>
           <w:i w:val="0"/>
-          <w:sz w:val="24"/>
+          <w:color w:val="3F3826"/>
+          <w:sz w:val="22"/>
         </w:rPr>
-        <w:t>Mariyanı xoşbəxt edən bütün gün boyu yaşadığı düşüncə və hisslərin özü idi...</w:t>
+        <w:t>Bir xoş söz insanın özünə münasibətini, bəzən isə bütün dünyasını dəyişə bilər. Xoşbəxtlik zahiri əşyalarda deyil, insanın daxilində və ona göstərilən səmimi diqqətdədir.</w:t>
       </w:r>
     </w:p>
     <w:p>
       <w:pPr>
-        <w:ind w:firstLine="425"/>
-        <w:jc w:val="both"/>
+        <w:keepLines/>
+        <w:widowControl/>
+        <w:spacing w:before="60" w:after="0" w:line="240" w:lineRule="auto"/>
+        <w:jc w:val="right"/>
       </w:pPr>
       <w:r>
         <w:rPr>
-          <w:rFonts w:ascii="Times New Roman" w:hAnsi="Times New Roman" w:cs="Times New Roman"/>
-          <w:b w:val="0"/>
-          <w:i w:val="0"/>
-          <w:sz w:val="24"/>
-        </w:rPr>
-        <w:t>İnsan yaşadığı xoşbəxtlikdən ətrafına parlaq işıq saçır. Adi şeylər sehrli görünür, qaranlıqlar aydınlanır, yaşamaq eşqi güclənir.</w:t>
-      </w:r>
-    </w:p>
-    <w:p>
-      <w:pPr>
-        <w:spacing w:after="40"/>
-      </w:pPr>
-    </w:p>
-    <w:p>
-      <w:pPr>
-        <w:pBdr>
-          <w:top w:val="single" w:sz="4" w:space="6" w:color="D9C7A3"/>
-          <w:left w:val="single" w:sz="24" w:space="12" w:color="B8860B"/>
-          <w:bottom w:val="single" w:sz="4" w:space="6" w:color="D9C7A3"/>
-          <w:right w:val="single" w:sz="4" w:space="10" w:color="D9C7A3"/>
-        </w:pBdr>
-        <w:shd w:val="clear" w:color="auto" w:fill="FBF6EA"/>
-        <w:spacing w:before="0" w:after="60"/>
-        <w:ind w:left="227" w:right="113"/>
-        <w:jc w:val="both"/>
-      </w:pPr>
-      <w:r>
-        <w:rPr>
-          <w:rFonts w:ascii="Times New Roman" w:hAnsi="Times New Roman" w:cs="Times New Roman"/>
+          <w:rFonts w:ascii="Arial" w:hAnsi="Arial" w:eastAsia="Arial" w:cs="Arial"/>
           <w:b w:val="0"/>
           <w:i/>
-          <w:color w:val="333333"/>
-          <w:sz w:val="24"/>
+          <w:color w:val="8A7950"/>
+          <w:sz w:val="17"/>
         </w:rPr>
-        <w:t>Bir xoş söz insanın bütün dünyasını dəyişir. Xoşbəxtlik zahiri bir əşyada yox, insanın öz içində və ona göstərilən diqqətdədir.</w:t>
+        <w:t>Hekayə açıq İnternet mənbələrindən əldə olunub.</w:t>
       </w:r>
-    </w:p>
-    <w:p>
-      <w:pPr>
-        <w:spacing w:after="120"/>
-      </w:pPr>
     </w:p>
     <w:sectPr>
       <w:pgSz w:w="12240" w:h="15840"/>
-      <w:pgMar w:top="1417" w:right="1417" w:bottom="1417" w:left="1417" w:header="720" w:footer="720" w:gutter="0"/>
+      <w:pgMar w:top="1440" w:right="1440" w:bottom="1440" w:left="1440" w:header="708" w:footer="708" w:gutter="0"/>
       <w:cols w:space="720"/>
       <w:docGrid w:linePitch="360"/>
     </w:sectPr>
@@ -808,12 +713,12 @@
     <w:qFormat/>
     <w:rsid w:val="00FC693F"/>
     <w:pPr>
-      <w:spacing w:line="276" w:lineRule="auto" w:after="120" w:before="0"/>
-      <w:jc w:val="both"/>
+      <w:spacing w:before="0" w:after="160" w:line="276" w:lineRule="auto"/>
     </w:pPr>
     <w:rPr>
-      <w:rFonts w:ascii="Times New Roman" w:hAnsi="Times New Roman" w:cs="Times New Roman"/>
-      <w:sz w:val="24"/>
+      <w:rFonts w:ascii="Arial" w:hAnsi="Arial" w:eastAsia="Arial"/>
+      <w:color w:val="000000"/>
+      <w:sz w:val="22"/>
     </w:rPr>
   </w:style>
   <w:style w:type="paragraph" w:styleId="Header">
@@ -871,17 +776,15 @@
     <w:pPr>
       <w:keepNext/>
       <w:keepLines/>
-      <w:spacing w:before="360" w:after="160"/>
-      <w:jc w:val="left"/>
+      <w:spacing w:before="480" w:after="0"/>
       <w:outlineLvl w:val="0"/>
     </w:pPr>
     <w:rPr>
-      <w:rFonts w:asciiTheme="majorHAnsi" w:eastAsiaTheme="majorEastAsia" w:hAnsiTheme="majorHAnsi" w:cstheme="majorBidi" w:ascii="Times New Roman" w:hAnsi="Times New Roman" w:cs="Times New Roman"/>
+      <w:rFonts w:asciiTheme="majorHAnsi" w:eastAsiaTheme="majorEastAsia" w:hAnsiTheme="majorHAnsi" w:cstheme="majorBidi"/>
       <w:b/>
       <w:bCs/>
-      <w:i w:val="0"/>
-      <w:color w:val="1F1F1F"/>
-      <w:sz w:val="30"/>
+      <w:color w:val="365F91" w:themeColor="accent1" w:themeShade="BF"/>
+      <w:sz w:val="28"/>
       <w:szCs w:val="28"/>
     </w:rPr>
   </w:style>
@@ -12499,6 +12402,18 @@
         <w:shd w:val="clear" w:color="auto" w:fill="FBCAA2" w:themeFill="accent6" w:themeFillTint="7F"/>
       </w:tcPr>
     </w:tblStylePr>
+  </w:style>
+  <w:style w:type="paragraph" w:customStyle="1" w:styleId="Moral">
+    <w:name w:val="Moral"/>
+    <w:basedOn w:val="Normal"/>
+    <w:pPr>
+      <w:spacing w:before="160" w:after="0" w:line="276" w:lineRule="auto"/>
+    </w:pPr>
+    <w:rPr>
+      <w:rFonts w:ascii="Arial" w:hAnsi="Arial" w:eastAsia="Arial"/>
+      <w:i/>
+      <w:sz w:val="22"/>
+    </w:rPr>
   </w:style>
 </w:styles>
 </file>

</xml_diff>